<commit_message>
Scroll up-down feature released
</commit_message>
<xml_diff>
--- a/AgendaBeforeInitialPoll[1].docx
+++ b/AgendaBeforeInitialPoll[1].docx
@@ -158,8 +158,6 @@
           </wp:inline>
         </w:drawing>
       </w:r>
-      <w:bookmarkStart w:id="0" w:name="_GoBack"/>
-      <w:bookmarkEnd w:id="0"/>
     </w:p>
     <w:p>
       <w:pPr>
@@ -388,7 +386,7 @@
           <w:szCs w:val="32"/>
           <w:lang w:val="en-US"/>
         </w:rPr>
-        <w:t>Task1: Making a feature of switching tabs.</w:t>
+        <w:t>Task1: making a feature of scrolling up and down.</w:t>
       </w:r>
     </w:p>
     <w:p>
@@ -408,33 +406,6 @@
       </w:pPr>
       <w:r>
         <w:rPr>
-          <w:rFonts w:hint="default" w:ascii="Times New Roman" w:hAnsi="Times New Roman" w:cs="Times New Roman"/>
-          <w:b w:val="0"/>
-          <w:bCs w:val="0"/>
-          <w:sz w:val="32"/>
-          <w:szCs w:val="32"/>
-          <w:lang w:val="en-US"/>
-        </w:rPr>
-        <w:t xml:space="preserve"> </w:t>
-      </w:r>
-      <w:r>
-        <w:rPr>
-          <w:rFonts w:hint="default" w:ascii="Georgia" w:hAnsi="Georgia" w:eastAsia="Georgia" w:cs="Georgia"/>
-          <w:i w:val="0"/>
-          <w:iCs w:val="0"/>
-          <w:caps w:val="0"/>
-          <w:color w:val="242424"/>
-          <w:spacing w:val="-1"/>
-          <w:sz w:val="24"/>
-          <w:szCs w:val="24"/>
-          <w:shd w:val="clear" w:fill="FFFFFF"/>
-        </w:rPr>
-        <w:t> </w:t>
-      </w:r>
-    </w:p>
-    <w:p>
-      <w:pPr>
-        <w:rPr>
           <w:rFonts w:hint="default" w:ascii="Times New Roman" w:hAnsi="Times New Roman" w:eastAsia="Georgia" w:cs="Times New Roman"/>
           <w:i w:val="0"/>
           <w:iCs w:val="0"/>
@@ -446,7 +417,8 @@
           <w:shd w:val="clear" w:fill="FFFFFF"/>
           <w:lang w:val="en-US"/>
         </w:rPr>
-      </w:pPr>
+        <w:t>Task2: making a feature of reloading tabs.</w:t>
+      </w:r>
     </w:p>
     <w:p>
       <w:pPr>
@@ -476,8 +448,72 @@
           <w:shd w:val="clear" w:fill="FFFFFF"/>
           <w:lang w:val="en-US"/>
         </w:rPr>
-        <w:t>Task2: making a feature of reloading tabs.</w:t>
-      </w:r>
+        <w:t>Task3: making a feature of restarting window.</w:t>
+      </w:r>
+    </w:p>
+    <w:p>
+      <w:pPr>
+        <w:rPr>
+          <w:rFonts w:hint="default" w:ascii="Times New Roman" w:hAnsi="Times New Roman" w:eastAsia="Georgia" w:cs="Times New Roman"/>
+          <w:i w:val="0"/>
+          <w:iCs w:val="0"/>
+          <w:caps w:val="0"/>
+          <w:color w:val="242424"/>
+          <w:spacing w:val="-1"/>
+          <w:sz w:val="32"/>
+          <w:szCs w:val="32"/>
+          <w:shd w:val="clear" w:fill="FFFFFF"/>
+          <w:lang w:val="en-US"/>
+        </w:rPr>
+      </w:pPr>
+      <w:r>
+        <w:rPr>
+          <w:rFonts w:hint="default" w:ascii="Times New Roman" w:hAnsi="Times New Roman" w:eastAsia="Georgia" w:cs="Times New Roman"/>
+          <w:i w:val="0"/>
+          <w:iCs w:val="0"/>
+          <w:caps w:val="0"/>
+          <w:color w:val="242424"/>
+          <w:spacing w:val="-1"/>
+          <w:sz w:val="32"/>
+          <w:szCs w:val="32"/>
+          <w:shd w:val="clear" w:fill="FFFFFF"/>
+          <w:lang w:val="en-US"/>
+        </w:rPr>
+        <w:t>Task4: making a feature of zooming the screen.</w:t>
+      </w:r>
+    </w:p>
+    <w:p>
+      <w:pPr>
+        <w:rPr>
+          <w:rFonts w:hint="default" w:ascii="Times New Roman" w:hAnsi="Times New Roman" w:eastAsia="Georgia" w:cs="Times New Roman"/>
+          <w:i w:val="0"/>
+          <w:iCs w:val="0"/>
+          <w:caps w:val="0"/>
+          <w:color w:val="242424"/>
+          <w:spacing w:val="-1"/>
+          <w:sz w:val="32"/>
+          <w:szCs w:val="32"/>
+          <w:shd w:val="clear" w:fill="FFFFFF"/>
+          <w:lang w:val="en-US"/>
+        </w:rPr>
+      </w:pPr>
+      <w:r>
+        <w:rPr>
+          <w:rFonts w:hint="default" w:ascii="Times New Roman" w:hAnsi="Times New Roman" w:eastAsia="Georgia" w:cs="Times New Roman"/>
+          <w:i w:val="0"/>
+          <w:iCs w:val="0"/>
+          <w:caps w:val="0"/>
+          <w:color w:val="242424"/>
+          <w:spacing w:val="-1"/>
+          <w:sz w:val="32"/>
+          <w:szCs w:val="32"/>
+          <w:shd w:val="clear" w:fill="FFFFFF"/>
+          <w:lang w:val="en-US"/>
+        </w:rPr>
+        <w:t>Task5: Switching tabs.</w:t>
+      </w:r>
+      <w:bookmarkStart w:id="0" w:name="_GoBack"/>
+      <w:bookmarkEnd w:id="0"/>
     </w:p>
     <w:p>
       <w:pPr>

</xml_diff>